<commit_message>
feat: Addfaculty DTOs and update dto files structure
</commit_message>
<xml_diff>
--- a/doc/requeriments.docx
+++ b/doc/requeriments.docx
@@ -4,6 +4,7 @@
   <w:body>
     <w:p>
       <w:pPr>
+        <w:ind w:firstLine="720"/>
         <w:jc w:val="center"/>
         <w:rPr>
           <w:rFonts w:ascii="Times New Roman" w:hAnsi="Times New Roman" w:cs="Times New Roman"/>
@@ -57,23 +58,7 @@
           <w:rFonts w:ascii="Times New Roman" w:hAnsi="Times New Roman" w:cs="Times New Roman"/>
           <w:lang w:val="es-DO"/>
         </w:rPr>
-        <w:t xml:space="preserve">API </w:t>
-      </w:r>
-      <w:proofErr w:type="spellStart"/>
-      <w:r>
-        <w:rPr>
-          <w:rFonts w:ascii="Times New Roman" w:hAnsi="Times New Roman" w:cs="Times New Roman"/>
-          <w:lang w:val="es-DO"/>
-        </w:rPr>
-        <w:t>RESTful</w:t>
-      </w:r>
-      <w:proofErr w:type="spellEnd"/>
-      <w:r>
-        <w:rPr>
-          <w:rFonts w:ascii="Times New Roman" w:hAnsi="Times New Roman" w:cs="Times New Roman"/>
-          <w:lang w:val="es-DO"/>
-        </w:rPr>
-        <w:t xml:space="preserve"> para gestionar información académica básica de una institución universitaria, basada en las siguientes entidades:</w:t>
+        <w:t>API RESTful para gestionar información académica básica de una institución universitaria, basada en las siguientes entidades:</w:t>
       </w:r>
     </w:p>
     <w:p>
@@ -105,14 +90,12 @@
           <w:rFonts w:ascii="Times New Roman" w:hAnsi="Times New Roman" w:cs="Times New Roman"/>
         </w:rPr>
       </w:pPr>
-      <w:proofErr w:type="spellStart"/>
       <w:r>
         <w:rPr>
           <w:rFonts w:ascii="Times New Roman" w:hAnsi="Times New Roman" w:cs="Times New Roman"/>
         </w:rPr>
         <w:t>Academic_Record</w:t>
       </w:r>
-      <w:proofErr w:type="spellEnd"/>
     </w:p>
     <w:p>
       <w:pPr>
@@ -161,19 +144,11 @@
           <w:rFonts w:ascii="Times New Roman" w:hAnsi="Times New Roman" w:cs="Times New Roman"/>
         </w:rPr>
       </w:pPr>
-      <w:proofErr w:type="spellStart"/>
-      <w:r>
-        <w:rPr>
-          <w:rFonts w:ascii="Times New Roman" w:hAnsi="Times New Roman" w:cs="Times New Roman"/>
-        </w:rPr>
-        <w:t>Catalog_Course</w:t>
-      </w:r>
-      <w:proofErr w:type="spellEnd"/>
-      <w:r>
-        <w:rPr>
-          <w:rFonts w:ascii="Times New Roman" w:hAnsi="Times New Roman" w:cs="Times New Roman"/>
-        </w:rPr>
-        <w:t xml:space="preserve"> (Subject)   </w:t>
+      <w:r>
+        <w:rPr>
+          <w:rFonts w:ascii="Times New Roman" w:hAnsi="Times New Roman" w:cs="Times New Roman"/>
+        </w:rPr>
+        <w:t xml:space="preserve">Catalog_Course (Subject)   </w:t>
       </w:r>
     </w:p>
     <w:p>
@@ -188,21 +163,12 @@
           <w:lang w:val="es-DO"/>
         </w:rPr>
       </w:pPr>
-      <w:proofErr w:type="spellStart"/>
-      <w:r>
-        <w:rPr>
-          <w:rFonts w:ascii="Times New Roman" w:hAnsi="Times New Roman" w:cs="Times New Roman"/>
-          <w:lang w:val="es-DO"/>
-        </w:rPr>
-        <w:t>Enrollment</w:t>
-      </w:r>
-      <w:proofErr w:type="spellEnd"/>
-      <w:r>
-        <w:rPr>
-          <w:rFonts w:ascii="Times New Roman" w:hAnsi="Times New Roman" w:cs="Times New Roman"/>
-          <w:lang w:val="es-DO"/>
-        </w:rPr>
-        <w:t xml:space="preserve">   </w:t>
+      <w:r>
+        <w:rPr>
+          <w:rFonts w:ascii="Times New Roman" w:hAnsi="Times New Roman" w:cs="Times New Roman"/>
+          <w:lang w:val="es-DO"/>
+        </w:rPr>
+        <w:t xml:space="preserve">Enrollment   </w:t>
       </w:r>
     </w:p>
     <w:p>
@@ -458,49 +424,7 @@
         <w:rPr>
           <w:rFonts w:ascii="Times New Roman" w:hAnsi="Times New Roman" w:cs="Times New Roman"/>
         </w:rPr>
-        <w:t xml:space="preserve"> (</w:t>
-      </w:r>
-      <w:proofErr w:type="spellStart"/>
-      <w:r>
-        <w:rPr>
-          <w:rFonts w:ascii="Times New Roman" w:hAnsi="Times New Roman" w:cs="Times New Roman"/>
-        </w:rPr>
-        <w:t>StudentId</w:t>
-      </w:r>
-      <w:proofErr w:type="spellEnd"/>
-      <w:r>
-        <w:rPr>
-          <w:rFonts w:ascii="Times New Roman" w:hAnsi="Times New Roman" w:cs="Times New Roman"/>
-        </w:rPr>
-        <w:t xml:space="preserve"> (PK), FirstName, LastName, </w:t>
-      </w:r>
-      <w:proofErr w:type="spellStart"/>
-      <w:r>
-        <w:rPr>
-          <w:rFonts w:ascii="Times New Roman" w:hAnsi="Times New Roman" w:cs="Times New Roman"/>
-        </w:rPr>
-        <w:t>BirthDay</w:t>
-      </w:r>
-      <w:proofErr w:type="spellEnd"/>
-      <w:r>
-        <w:rPr>
-          <w:rFonts w:ascii="Times New Roman" w:hAnsi="Times New Roman" w:cs="Times New Roman"/>
-        </w:rPr>
-        <w:t xml:space="preserve">, Gender, Email, </w:t>
-      </w:r>
-      <w:proofErr w:type="spellStart"/>
-      <w:r>
-        <w:rPr>
-          <w:rFonts w:ascii="Times New Roman" w:hAnsi="Times New Roman" w:cs="Times New Roman"/>
-        </w:rPr>
-        <w:t>PhoneNumber</w:t>
-      </w:r>
-      <w:proofErr w:type="spellEnd"/>
-      <w:r>
-        <w:rPr>
-          <w:rFonts w:ascii="Times New Roman" w:hAnsi="Times New Roman" w:cs="Times New Roman"/>
-        </w:rPr>
-        <w:t>, Address, Nationality)</w:t>
+        <w:t xml:space="preserve"> (StudentId (PK), FirstName, LastName, BirthDay, Gender, Email, PhoneNumber, Address, Nationality)</w:t>
       </w:r>
     </w:p>
     <w:p>
@@ -514,7 +438,6 @@
           <w:rFonts w:ascii="Times New Roman" w:hAnsi="Times New Roman" w:cs="Times New Roman"/>
         </w:rPr>
       </w:pPr>
-      <w:proofErr w:type="spellStart"/>
       <w:r>
         <w:rPr>
           <w:rFonts w:ascii="Times New Roman" w:hAnsi="Times New Roman" w:cs="Times New Roman"/>
@@ -523,7 +446,6 @@
         </w:rPr>
         <w:t>Academic_Record</w:t>
       </w:r>
-      <w:proofErr w:type="spellEnd"/>
       <w:r>
         <w:rPr>
           <w:rFonts w:ascii="Times New Roman" w:hAnsi="Times New Roman" w:cs="Times New Roman"/>
@@ -536,91 +458,7 @@
         <w:rPr>
           <w:rFonts w:ascii="Times New Roman" w:hAnsi="Times New Roman" w:cs="Times New Roman"/>
         </w:rPr>
-        <w:t xml:space="preserve"> (</w:t>
-      </w:r>
-      <w:proofErr w:type="spellStart"/>
-      <w:r>
-        <w:rPr>
-          <w:rFonts w:ascii="Times New Roman" w:hAnsi="Times New Roman" w:cs="Times New Roman"/>
-        </w:rPr>
-        <w:t>RecordId</w:t>
-      </w:r>
-      <w:proofErr w:type="spellEnd"/>
-      <w:r>
-        <w:rPr>
-          <w:rFonts w:ascii="Times New Roman" w:hAnsi="Times New Roman" w:cs="Times New Roman"/>
-        </w:rPr>
-        <w:t xml:space="preserve"> (PK), </w:t>
-      </w:r>
-      <w:proofErr w:type="spellStart"/>
-      <w:r>
-        <w:rPr>
-          <w:rFonts w:ascii="Times New Roman" w:hAnsi="Times New Roman" w:cs="Times New Roman"/>
-        </w:rPr>
-        <w:t>StudentId</w:t>
-      </w:r>
-      <w:proofErr w:type="spellEnd"/>
-      <w:r>
-        <w:rPr>
-          <w:rFonts w:ascii="Times New Roman" w:hAnsi="Times New Roman" w:cs="Times New Roman"/>
-        </w:rPr>
-        <w:t xml:space="preserve"> (FK), Matricula, </w:t>
-      </w:r>
-      <w:proofErr w:type="spellStart"/>
-      <w:r>
-        <w:rPr>
-          <w:rFonts w:ascii="Times New Roman" w:hAnsi="Times New Roman" w:cs="Times New Roman"/>
-        </w:rPr>
-        <w:t>CareerId</w:t>
-      </w:r>
-      <w:proofErr w:type="spellEnd"/>
-      <w:r>
-        <w:rPr>
-          <w:rFonts w:ascii="Times New Roman" w:hAnsi="Times New Roman" w:cs="Times New Roman"/>
-        </w:rPr>
-        <w:t xml:space="preserve">, </w:t>
-      </w:r>
-      <w:proofErr w:type="spellStart"/>
-      <w:r>
-        <w:rPr>
-          <w:rFonts w:ascii="Times New Roman" w:hAnsi="Times New Roman" w:cs="Times New Roman"/>
-        </w:rPr>
-        <w:t>FacultyId</w:t>
-      </w:r>
-      <w:proofErr w:type="spellEnd"/>
-      <w:r>
-        <w:rPr>
-          <w:rFonts w:ascii="Times New Roman" w:hAnsi="Times New Roman" w:cs="Times New Roman"/>
-        </w:rPr>
-        <w:t xml:space="preserve">, </w:t>
-      </w:r>
-      <w:proofErr w:type="spellStart"/>
-      <w:r>
-        <w:rPr>
-          <w:rFonts w:ascii="Times New Roman" w:hAnsi="Times New Roman" w:cs="Times New Roman"/>
-        </w:rPr>
-        <w:t>YearEnrollment</w:t>
-      </w:r>
-      <w:proofErr w:type="spellEnd"/>
-      <w:r>
-        <w:rPr>
-          <w:rFonts w:ascii="Times New Roman" w:hAnsi="Times New Roman" w:cs="Times New Roman"/>
-        </w:rPr>
-        <w:t xml:space="preserve">¸ </w:t>
-      </w:r>
-      <w:proofErr w:type="spellStart"/>
-      <w:r>
-        <w:rPr>
-          <w:rFonts w:ascii="Times New Roman" w:hAnsi="Times New Roman" w:cs="Times New Roman"/>
-        </w:rPr>
-        <w:t>CurrentPeriod</w:t>
-      </w:r>
-      <w:proofErr w:type="spellEnd"/>
-      <w:r>
-        <w:rPr>
-          <w:rFonts w:ascii="Times New Roman" w:hAnsi="Times New Roman" w:cs="Times New Roman"/>
-        </w:rPr>
-        <w:t>, Average, State</w:t>
+        <w:t xml:space="preserve"> (RecordId (PK), StudentId (FK), Matricula, CareerId, FacultyId, YearEnrollment¸ CurrentPeriod, Average, State</w:t>
       </w:r>
     </w:p>
     <w:p>
@@ -646,35 +484,7 @@
         <w:rPr>
           <w:rFonts w:ascii="Times New Roman" w:hAnsi="Times New Roman" w:cs="Times New Roman"/>
         </w:rPr>
-        <w:t xml:space="preserve"> (</w:t>
-      </w:r>
-      <w:proofErr w:type="spellStart"/>
-      <w:r>
-        <w:rPr>
-          <w:rFonts w:ascii="Times New Roman" w:hAnsi="Times New Roman" w:cs="Times New Roman"/>
-        </w:rPr>
-        <w:t>ProfessorId</w:t>
-      </w:r>
-      <w:proofErr w:type="spellEnd"/>
-      <w:r>
-        <w:rPr>
-          <w:rFonts w:ascii="Times New Roman" w:hAnsi="Times New Roman" w:cs="Times New Roman"/>
-        </w:rPr>
-        <w:t xml:space="preserve"> (PK), FirstName, LastName, Email, Phone, </w:t>
-      </w:r>
-      <w:proofErr w:type="spellStart"/>
-      <w:r>
-        <w:rPr>
-          <w:rFonts w:ascii="Times New Roman" w:hAnsi="Times New Roman" w:cs="Times New Roman"/>
-        </w:rPr>
-        <w:t>DepartmentId</w:t>
-      </w:r>
-      <w:proofErr w:type="spellEnd"/>
-      <w:r>
-        <w:rPr>
-          <w:rFonts w:ascii="Times New Roman" w:hAnsi="Times New Roman" w:cs="Times New Roman"/>
-        </w:rPr>
-        <w:t xml:space="preserve"> (FK), Specialty, Status)</w:t>
+        <w:t xml:space="preserve"> (ProfessorId (PK), FirstName, LastName, Email, Phone, DepartmentId (FK), Specialty, Status)</w:t>
       </w:r>
     </w:p>
     <w:p>
@@ -700,29 +510,7 @@
         <w:rPr>
           <w:rFonts w:ascii="Times New Roman" w:hAnsi="Times New Roman" w:cs="Times New Roman"/>
         </w:rPr>
-        <w:t xml:space="preserve"> </w:t>
-      </w:r>
-      <w:proofErr w:type="gramStart"/>
-      <w:r>
-        <w:rPr>
-          <w:rFonts w:ascii="Times New Roman" w:hAnsi="Times New Roman" w:cs="Times New Roman"/>
-        </w:rPr>
-        <w:t xml:space="preserve">( </w:t>
-      </w:r>
-      <w:proofErr w:type="spellStart"/>
-      <w:r>
-        <w:rPr>
-          <w:rFonts w:ascii="Times New Roman" w:hAnsi="Times New Roman" w:cs="Times New Roman"/>
-        </w:rPr>
-        <w:t>DepartmentId</w:t>
-      </w:r>
-      <w:proofErr w:type="spellEnd"/>
-      <w:proofErr w:type="gramEnd"/>
-      <w:r>
-        <w:rPr>
-          <w:rFonts w:ascii="Times New Roman" w:hAnsi="Times New Roman" w:cs="Times New Roman"/>
-        </w:rPr>
-        <w:t xml:space="preserve"> (PK), Name</w:t>
+        <w:t xml:space="preserve"> ( DepartmentId (PK), Name</w:t>
       </w:r>
       <w:r>
         <w:rPr>
@@ -754,7 +542,6 @@
           <w:rFonts w:ascii="Times New Roman" w:hAnsi="Times New Roman" w:cs="Times New Roman"/>
         </w:rPr>
       </w:pPr>
-      <w:proofErr w:type="spellStart"/>
       <w:r>
         <w:rPr>
           <w:rFonts w:ascii="Times New Roman" w:hAnsi="Times New Roman" w:cs="Times New Roman"/>
@@ -763,48 +550,11 @@
         </w:rPr>
         <w:t>Catalog_Course</w:t>
       </w:r>
-      <w:proofErr w:type="spellEnd"/>
-      <w:r>
-        <w:rPr>
-          <w:rFonts w:ascii="Times New Roman" w:hAnsi="Times New Roman" w:cs="Times New Roman"/>
-        </w:rPr>
-        <w:t xml:space="preserve"> (Subject)</w:t>
-      </w:r>
-      <w:proofErr w:type="gramStart"/>
-      <w:r>
-        <w:rPr>
-          <w:rFonts w:ascii="Times New Roman" w:hAnsi="Times New Roman" w:cs="Times New Roman"/>
-        </w:rPr>
-        <w:t>:  (</w:t>
-      </w:r>
-      <w:proofErr w:type="spellStart"/>
-      <w:proofErr w:type="gramEnd"/>
-      <w:r>
-        <w:rPr>
-          <w:rFonts w:ascii="Times New Roman" w:hAnsi="Times New Roman" w:cs="Times New Roman"/>
-        </w:rPr>
-        <w:t>SubjectId</w:t>
-      </w:r>
-      <w:proofErr w:type="spellEnd"/>
-      <w:r>
-        <w:rPr>
-          <w:rFonts w:ascii="Times New Roman" w:hAnsi="Times New Roman" w:cs="Times New Roman"/>
-        </w:rPr>
-        <w:t xml:space="preserve"> (PK), </w:t>
-      </w:r>
-      <w:proofErr w:type="spellStart"/>
-      <w:r>
-        <w:rPr>
-          <w:rFonts w:ascii="Times New Roman" w:hAnsi="Times New Roman" w:cs="Times New Roman"/>
-        </w:rPr>
-        <w:t>RecordId</w:t>
-      </w:r>
-      <w:proofErr w:type="spellEnd"/>
-      <w:r>
-        <w:rPr>
-          <w:rFonts w:ascii="Times New Roman" w:hAnsi="Times New Roman" w:cs="Times New Roman"/>
-        </w:rPr>
-        <w:t xml:space="preserve"> (FK), Name, Code, Score</w:t>
+      <w:r>
+        <w:rPr>
+          <w:rFonts w:ascii="Times New Roman" w:hAnsi="Times New Roman" w:cs="Times New Roman"/>
+        </w:rPr>
+        <w:t xml:space="preserve"> (Subject):  (SubjectId (PK), RecordId (FK), Name, Code, Score</w:t>
       </w:r>
       <w:r>
         <w:rPr>
@@ -812,19 +562,11 @@
         </w:rPr>
         <w:t xml:space="preserve">, </w:t>
       </w:r>
-      <w:proofErr w:type="spellStart"/>
-      <w:r>
-        <w:rPr>
-          <w:rFonts w:ascii="Times New Roman" w:hAnsi="Times New Roman" w:cs="Times New Roman"/>
-        </w:rPr>
-        <w:t>ProfessorId</w:t>
-      </w:r>
-      <w:proofErr w:type="spellEnd"/>
-      <w:r>
-        <w:rPr>
-          <w:rFonts w:ascii="Times New Roman" w:hAnsi="Times New Roman" w:cs="Times New Roman"/>
-        </w:rPr>
-        <w:t xml:space="preserve"> (FK)</w:t>
+      <w:r>
+        <w:rPr>
+          <w:rFonts w:ascii="Times New Roman" w:hAnsi="Times New Roman" w:cs="Times New Roman"/>
+        </w:rPr>
+        <w:t>ProfessorId (FK)</w:t>
       </w:r>
       <w:r>
         <w:rPr>
@@ -856,63 +598,7 @@
         <w:rPr>
           <w:rFonts w:ascii="Times New Roman" w:hAnsi="Times New Roman" w:cs="Times New Roman"/>
         </w:rPr>
-        <w:t xml:space="preserve"> (</w:t>
-      </w:r>
-      <w:proofErr w:type="spellStart"/>
-      <w:r>
-        <w:rPr>
-          <w:rFonts w:ascii="Times New Roman" w:hAnsi="Times New Roman" w:cs="Times New Roman"/>
-        </w:rPr>
-        <w:t>EnrollmentId</w:t>
-      </w:r>
-      <w:proofErr w:type="spellEnd"/>
-      <w:r>
-        <w:rPr>
-          <w:rFonts w:ascii="Times New Roman" w:hAnsi="Times New Roman" w:cs="Times New Roman"/>
-        </w:rPr>
-        <w:t xml:space="preserve"> (PK), </w:t>
-      </w:r>
-      <w:proofErr w:type="spellStart"/>
-      <w:r>
-        <w:rPr>
-          <w:rFonts w:ascii="Times New Roman" w:hAnsi="Times New Roman" w:cs="Times New Roman"/>
-        </w:rPr>
-        <w:t>RecordId</w:t>
-      </w:r>
-      <w:proofErr w:type="spellEnd"/>
-      <w:r>
-        <w:rPr>
-          <w:rFonts w:ascii="Times New Roman" w:hAnsi="Times New Roman" w:cs="Times New Roman"/>
-        </w:rPr>
-        <w:t xml:space="preserve"> (FK), </w:t>
-      </w:r>
-      <w:proofErr w:type="spellStart"/>
-      <w:r>
-        <w:rPr>
-          <w:rFonts w:ascii="Times New Roman" w:hAnsi="Times New Roman" w:cs="Times New Roman"/>
-        </w:rPr>
-        <w:t>SubjectId</w:t>
-      </w:r>
-      <w:proofErr w:type="spellEnd"/>
-      <w:r>
-        <w:rPr>
-          <w:rFonts w:ascii="Times New Roman" w:hAnsi="Times New Roman" w:cs="Times New Roman"/>
-        </w:rPr>
-        <w:t xml:space="preserve"> (FK), </w:t>
-      </w:r>
-      <w:proofErr w:type="spellStart"/>
-      <w:r>
-        <w:rPr>
-          <w:rFonts w:ascii="Times New Roman" w:hAnsi="Times New Roman" w:cs="Times New Roman"/>
-        </w:rPr>
-        <w:t>EnrollDate</w:t>
-      </w:r>
-      <w:proofErr w:type="spellEnd"/>
-      <w:r>
-        <w:rPr>
-          <w:rFonts w:ascii="Times New Roman" w:hAnsi="Times New Roman" w:cs="Times New Roman"/>
-        </w:rPr>
-        <w:t>, Status)</w:t>
+        <w:t xml:space="preserve"> (EnrollmentId (PK), RecordId (FK), SubjectId (FK), EnrollDate, Status)</w:t>
       </w:r>
     </w:p>
     <w:p>
@@ -1198,23 +884,7 @@
           <w:rFonts w:ascii="Times New Roman" w:hAnsi="Times New Roman" w:cs="Times New Roman"/>
           <w:lang w:val="es-DO"/>
         </w:rPr>
-        <w:t xml:space="preserve">   Un Student tiene un </w:t>
-      </w:r>
-      <w:proofErr w:type="spellStart"/>
-      <w:r>
-        <w:rPr>
-          <w:rFonts w:ascii="Times New Roman" w:hAnsi="Times New Roman" w:cs="Times New Roman"/>
-          <w:lang w:val="es-DO"/>
-        </w:rPr>
-        <w:t>Academic_Record</w:t>
-      </w:r>
-      <w:proofErr w:type="spellEnd"/>
-      <w:r>
-        <w:rPr>
-          <w:rFonts w:ascii="Times New Roman" w:hAnsi="Times New Roman" w:cs="Times New Roman"/>
-          <w:lang w:val="es-DO"/>
-        </w:rPr>
-        <w:t>.</w:t>
+        <w:t xml:space="preserve">   Un Student tiene un Academic_Record.</w:t>
       </w:r>
     </w:p>
     <w:p>
@@ -1438,23 +1108,7 @@
           <w:rFonts w:ascii="Times New Roman" w:hAnsi="Times New Roman" w:cs="Times New Roman"/>
           <w:lang w:val="es-DO"/>
         </w:rPr>
-        <w:t xml:space="preserve">   Un </w:t>
-      </w:r>
-      <w:proofErr w:type="spellStart"/>
-      <w:r>
-        <w:rPr>
-          <w:rFonts w:ascii="Times New Roman" w:hAnsi="Times New Roman" w:cs="Times New Roman"/>
-          <w:lang w:val="es-DO"/>
-        </w:rPr>
-        <w:t>Academic_Record</w:t>
-      </w:r>
-      <w:proofErr w:type="spellEnd"/>
-      <w:r>
-        <w:rPr>
-          <w:rFonts w:ascii="Times New Roman" w:hAnsi="Times New Roman" w:cs="Times New Roman"/>
-          <w:lang w:val="es-DO"/>
-        </w:rPr>
-        <w:t xml:space="preserve"> pertenece a un Student.</w:t>
+        <w:t xml:space="preserve">   Un Academic_Record pertenece a un Student.</w:t>
       </w:r>
     </w:p>
     <w:p>
@@ -1470,23 +1124,7 @@
           <w:rFonts w:ascii="Times New Roman" w:hAnsi="Times New Roman" w:cs="Times New Roman"/>
           <w:lang w:val="es-DO"/>
         </w:rPr>
-        <w:t xml:space="preserve">   Un </w:t>
-      </w:r>
-      <w:proofErr w:type="spellStart"/>
-      <w:r>
-        <w:rPr>
-          <w:rFonts w:ascii="Times New Roman" w:hAnsi="Times New Roman" w:cs="Times New Roman"/>
-          <w:lang w:val="es-DO"/>
-        </w:rPr>
-        <w:t>Academic_Record</w:t>
-      </w:r>
-      <w:proofErr w:type="spellEnd"/>
-      <w:r>
-        <w:rPr>
-          <w:rFonts w:ascii="Times New Roman" w:hAnsi="Times New Roman" w:cs="Times New Roman"/>
-          <w:lang w:val="es-DO"/>
-        </w:rPr>
-        <w:t xml:space="preserve"> tiene múltiples asignaturas.</w:t>
+        <w:t xml:space="preserve">   Un Academic_Record tiene múltiples asignaturas.</w:t>
       </w:r>
     </w:p>
     <w:p>
@@ -1697,39 +1335,7 @@
           <w:rFonts w:ascii="Times New Roman" w:hAnsi="Times New Roman" w:cs="Times New Roman"/>
           <w:lang w:val="es-DO"/>
         </w:rPr>
-        <w:t xml:space="preserve">Un </w:t>
-      </w:r>
-      <w:proofErr w:type="spellStart"/>
-      <w:r>
-        <w:rPr>
-          <w:rFonts w:ascii="Times New Roman" w:hAnsi="Times New Roman" w:cs="Times New Roman"/>
-          <w:lang w:val="es-DO"/>
-        </w:rPr>
-        <w:t>Professor</w:t>
-      </w:r>
-      <w:proofErr w:type="spellEnd"/>
-      <w:r>
-        <w:rPr>
-          <w:rFonts w:ascii="Times New Roman" w:hAnsi="Times New Roman" w:cs="Times New Roman"/>
-          <w:lang w:val="es-DO"/>
-        </w:rPr>
-        <w:t xml:space="preserve"> pertenece a un </w:t>
-      </w:r>
-      <w:proofErr w:type="spellStart"/>
-      <w:r>
-        <w:rPr>
-          <w:rFonts w:ascii="Times New Roman" w:hAnsi="Times New Roman" w:cs="Times New Roman"/>
-          <w:lang w:val="es-DO"/>
-        </w:rPr>
-        <w:t>Department</w:t>
-      </w:r>
-      <w:proofErr w:type="spellEnd"/>
-      <w:r>
-        <w:rPr>
-          <w:rFonts w:ascii="Times New Roman" w:hAnsi="Times New Roman" w:cs="Times New Roman"/>
-          <w:lang w:val="es-DO"/>
-        </w:rPr>
-        <w:t>.</w:t>
+        <w:t>Un Professor pertenece a un Department.</w:t>
       </w:r>
     </w:p>
     <w:p>
@@ -1765,23 +1371,7 @@
           <w:rFonts w:ascii="Times New Roman" w:hAnsi="Times New Roman" w:cs="Times New Roman"/>
           <w:lang w:val="es-DO"/>
         </w:rPr>
-        <w:t xml:space="preserve">Un </w:t>
-      </w:r>
-      <w:proofErr w:type="spellStart"/>
-      <w:r>
-        <w:rPr>
-          <w:rFonts w:ascii="Times New Roman" w:hAnsi="Times New Roman" w:cs="Times New Roman"/>
-          <w:lang w:val="es-DO"/>
-        </w:rPr>
-        <w:t>Professor</w:t>
-      </w:r>
-      <w:proofErr w:type="spellEnd"/>
-      <w:r>
-        <w:rPr>
-          <w:rFonts w:ascii="Times New Roman" w:hAnsi="Times New Roman" w:cs="Times New Roman"/>
-          <w:lang w:val="es-DO"/>
-        </w:rPr>
-        <w:t xml:space="preserve"> puede impartir varios cursos.</w:t>
+        <w:t>Un Professor puede impartir varios cursos.</w:t>
       </w:r>
     </w:p>
     <w:p>
@@ -1953,39 +1543,7 @@
           <w:rFonts w:ascii="Times New Roman" w:hAnsi="Times New Roman" w:cs="Times New Roman"/>
           <w:lang w:val="es-DO"/>
         </w:rPr>
-        <w:t xml:space="preserve"> Un </w:t>
-      </w:r>
-      <w:proofErr w:type="spellStart"/>
-      <w:r>
-        <w:rPr>
-          <w:rFonts w:ascii="Times New Roman" w:hAnsi="Times New Roman" w:cs="Times New Roman"/>
-          <w:lang w:val="es-DO"/>
-        </w:rPr>
-        <w:t>Department</w:t>
-      </w:r>
-      <w:proofErr w:type="spellEnd"/>
-      <w:r>
-        <w:rPr>
-          <w:rFonts w:ascii="Times New Roman" w:hAnsi="Times New Roman" w:cs="Times New Roman"/>
-          <w:lang w:val="es-DO"/>
-        </w:rPr>
-        <w:t xml:space="preserve"> tiene múltiples </w:t>
-      </w:r>
-      <w:proofErr w:type="spellStart"/>
-      <w:r>
-        <w:rPr>
-          <w:rFonts w:ascii="Times New Roman" w:hAnsi="Times New Roman" w:cs="Times New Roman"/>
-          <w:lang w:val="es-DO"/>
-        </w:rPr>
-        <w:t>Professors</w:t>
-      </w:r>
-      <w:proofErr w:type="spellEnd"/>
-      <w:r>
-        <w:rPr>
-          <w:rFonts w:ascii="Times New Roman" w:hAnsi="Times New Roman" w:cs="Times New Roman"/>
-          <w:lang w:val="es-DO"/>
-        </w:rPr>
-        <w:t>.</w:t>
+        <w:t xml:space="preserve"> Un Department tiene múltiples Professors.</w:t>
       </w:r>
     </w:p>
     <w:p>
@@ -2013,23 +1571,7 @@
           <w:rFonts w:ascii="Times New Roman" w:hAnsi="Times New Roman" w:cs="Times New Roman"/>
           <w:lang w:val="es-DO"/>
         </w:rPr>
-        <w:t xml:space="preserve"> Gestión de Asignaturas (</w:t>
-      </w:r>
-      <w:proofErr w:type="spellStart"/>
-      <w:r>
-        <w:rPr>
-          <w:rFonts w:ascii="Times New Roman" w:hAnsi="Times New Roman" w:cs="Times New Roman"/>
-          <w:lang w:val="es-DO"/>
-        </w:rPr>
-        <w:t>Catalog_Course</w:t>
-      </w:r>
-      <w:proofErr w:type="spellEnd"/>
-      <w:r>
-        <w:rPr>
-          <w:rFonts w:ascii="Times New Roman" w:hAnsi="Times New Roman" w:cs="Times New Roman"/>
-          <w:lang w:val="es-DO"/>
-        </w:rPr>
-        <w:t>)</w:t>
+        <w:t xml:space="preserve"> Gestión de Asignaturas (Catalog_Course)</w:t>
       </w:r>
     </w:p>
     <w:p>
@@ -2211,23 +1753,7 @@
           <w:rFonts w:ascii="Times New Roman" w:hAnsi="Times New Roman" w:cs="Times New Roman"/>
           <w:lang w:val="es-DO"/>
         </w:rPr>
-        <w:t xml:space="preserve">Una asignatura pertenece a un </w:t>
-      </w:r>
-      <w:proofErr w:type="spellStart"/>
-      <w:r>
-        <w:rPr>
-          <w:rFonts w:ascii="Times New Roman" w:hAnsi="Times New Roman" w:cs="Times New Roman"/>
-          <w:lang w:val="es-DO"/>
-        </w:rPr>
-        <w:t>Academic_Record</w:t>
-      </w:r>
-      <w:proofErr w:type="spellEnd"/>
-      <w:r>
-        <w:rPr>
-          <w:rFonts w:ascii="Times New Roman" w:hAnsi="Times New Roman" w:cs="Times New Roman"/>
-          <w:lang w:val="es-DO"/>
-        </w:rPr>
-        <w:t>.</w:t>
+        <w:t>Una asignatura pertenece a un Academic_Record.</w:t>
       </w:r>
     </w:p>
     <w:p>
@@ -2277,23 +1803,7 @@
           <w:rFonts w:ascii="Times New Roman" w:hAnsi="Times New Roman" w:cs="Times New Roman"/>
           <w:lang w:val="es-DO"/>
         </w:rPr>
-        <w:t xml:space="preserve">Una asignatura es impartida por un </w:t>
-      </w:r>
-      <w:proofErr w:type="spellStart"/>
-      <w:r>
-        <w:rPr>
-          <w:rFonts w:ascii="Times New Roman" w:hAnsi="Times New Roman" w:cs="Times New Roman"/>
-          <w:lang w:val="es-DO"/>
-        </w:rPr>
-        <w:t>Professor</w:t>
-      </w:r>
-      <w:proofErr w:type="spellEnd"/>
-      <w:r>
-        <w:rPr>
-          <w:rFonts w:ascii="Times New Roman" w:hAnsi="Times New Roman" w:cs="Times New Roman"/>
-          <w:lang w:val="es-DO"/>
-        </w:rPr>
-        <w:t>.</w:t>
+        <w:t>Una asignatura es impartida por un Professor.</w:t>
       </w:r>
     </w:p>
     <w:p>
@@ -2339,27 +1849,7 @@
           <w:bCs/>
           <w:lang w:val="es-DO"/>
         </w:rPr>
-        <w:t>Gestión de Matrícula (</w:t>
-      </w:r>
-      <w:proofErr w:type="spellStart"/>
-      <w:r>
-        <w:rPr>
-          <w:rFonts w:ascii="Times New Roman" w:hAnsi="Times New Roman" w:cs="Times New Roman"/>
-          <w:b/>
-          <w:bCs/>
-          <w:lang w:val="es-DO"/>
-        </w:rPr>
-        <w:t>Enrollment</w:t>
-      </w:r>
-      <w:proofErr w:type="spellEnd"/>
-      <w:r>
-        <w:rPr>
-          <w:rFonts w:ascii="Times New Roman" w:hAnsi="Times New Roman" w:cs="Times New Roman"/>
-          <w:b/>
-          <w:bCs/>
-          <w:lang w:val="es-DO"/>
-        </w:rPr>
-        <w:t>)</w:t>
+        <w:t>Gestión de Matrícula (Enrollment)</w:t>
       </w:r>
     </w:p>
     <w:p>
@@ -2529,21 +2019,7 @@
         <w:rPr>
           <w:rFonts w:ascii="Times New Roman" w:hAnsi="Times New Roman" w:cs="Times New Roman"/>
         </w:rPr>
-        <w:t xml:space="preserve">Enrollment vincula </w:t>
-      </w:r>
-      <w:proofErr w:type="spellStart"/>
-      <w:r>
-        <w:rPr>
-          <w:rFonts w:ascii="Times New Roman" w:hAnsi="Times New Roman" w:cs="Times New Roman"/>
-        </w:rPr>
-        <w:t>Academic_Record</w:t>
-      </w:r>
-      <w:proofErr w:type="spellEnd"/>
-      <w:r>
-        <w:rPr>
-          <w:rFonts w:ascii="Times New Roman" w:hAnsi="Times New Roman" w:cs="Times New Roman"/>
-        </w:rPr>
-        <w:t xml:space="preserve"> con Subject.</w:t>
+        <w:t>Enrollment vincula Academic_Record con Subject.</w:t>
       </w:r>
     </w:p>
     <w:p>
@@ -2769,18 +2245,8 @@
           <w:b/>
           <w:bCs/>
         </w:rPr>
-        <w:t xml:space="preserve"> Endpoints </w:t>
-      </w:r>
-      <w:proofErr w:type="spellStart"/>
-      <w:r>
-        <w:rPr>
-          <w:rFonts w:ascii="Times New Roman" w:hAnsi="Times New Roman" w:cs="Times New Roman"/>
-          <w:b/>
-          <w:bCs/>
-        </w:rPr>
-        <w:t>Principales</w:t>
-      </w:r>
-      <w:proofErr w:type="spellEnd"/>
+        <w:t xml:space="preserve"> Endpoints Principales</w:t>
+      </w:r>
     </w:p>
     <w:p>
       <w:pPr>
@@ -2822,23 +2288,7 @@
           <w:rFonts w:ascii="Times New Roman" w:hAnsi="Times New Roman" w:cs="Times New Roman"/>
           <w:highlight w:val="yellow"/>
         </w:rPr>
-        <w:t>GET    /</w:t>
-      </w:r>
-      <w:proofErr w:type="spellStart"/>
-      <w:r>
-        <w:rPr>
-          <w:rFonts w:ascii="Times New Roman" w:hAnsi="Times New Roman" w:cs="Times New Roman"/>
-          <w:highlight w:val="yellow"/>
-        </w:rPr>
-        <w:t>api</w:t>
-      </w:r>
-      <w:proofErr w:type="spellEnd"/>
-      <w:r>
-        <w:rPr>
-          <w:rFonts w:ascii="Times New Roman" w:hAnsi="Times New Roman" w:cs="Times New Roman"/>
-          <w:highlight w:val="yellow"/>
-        </w:rPr>
-        <w:t>/v1/students</w:t>
+        <w:t>GET    /api/v1/students</w:t>
       </w:r>
       <w:r>
         <w:rPr>
@@ -2865,23 +2315,7 @@
           <w:rFonts w:ascii="Times New Roman" w:hAnsi="Times New Roman" w:cs="Times New Roman"/>
           <w:highlight w:val="yellow"/>
         </w:rPr>
-        <w:t>POST   /</w:t>
-      </w:r>
-      <w:proofErr w:type="spellStart"/>
-      <w:r>
-        <w:rPr>
-          <w:rFonts w:ascii="Times New Roman" w:hAnsi="Times New Roman" w:cs="Times New Roman"/>
-          <w:highlight w:val="yellow"/>
-        </w:rPr>
-        <w:t>api</w:t>
-      </w:r>
-      <w:proofErr w:type="spellEnd"/>
-      <w:r>
-        <w:rPr>
-          <w:rFonts w:ascii="Times New Roman" w:hAnsi="Times New Roman" w:cs="Times New Roman"/>
-          <w:highlight w:val="yellow"/>
-        </w:rPr>
-        <w:t>/v1/students</w:t>
+        <w:t>POST   /api/v1/students</w:t>
       </w:r>
     </w:p>
     <w:p>
@@ -2901,39 +2335,7 @@
           <w:rFonts w:ascii="Times New Roman" w:hAnsi="Times New Roman" w:cs="Times New Roman"/>
           <w:highlight w:val="yellow"/>
         </w:rPr>
-        <w:t>GET    /</w:t>
-      </w:r>
-      <w:proofErr w:type="spellStart"/>
-      <w:r>
-        <w:rPr>
-          <w:rFonts w:ascii="Times New Roman" w:hAnsi="Times New Roman" w:cs="Times New Roman"/>
-          <w:highlight w:val="yellow"/>
-        </w:rPr>
-        <w:t>api</w:t>
-      </w:r>
-      <w:proofErr w:type="spellEnd"/>
-      <w:r>
-        <w:rPr>
-          <w:rFonts w:ascii="Times New Roman" w:hAnsi="Times New Roman" w:cs="Times New Roman"/>
-          <w:highlight w:val="yellow"/>
-        </w:rPr>
-        <w:t>/v1/students</w:t>
-      </w:r>
-      <w:proofErr w:type="gramStart"/>
-      <w:r>
-        <w:rPr>
-          <w:rFonts w:ascii="Times New Roman" w:hAnsi="Times New Roman" w:cs="Times New Roman"/>
-          <w:highlight w:val="yellow"/>
-        </w:rPr>
-        <w:t>/{</w:t>
-      </w:r>
-      <w:proofErr w:type="gramEnd"/>
-      <w:r>
-        <w:rPr>
-          <w:rFonts w:ascii="Times New Roman" w:hAnsi="Times New Roman" w:cs="Times New Roman"/>
-          <w:highlight w:val="yellow"/>
-        </w:rPr>
-        <w:t>id</w:t>
+        <w:t>GET    /api/v1/students/{id</w:t>
       </w:r>
     </w:p>
     <w:p>
@@ -2955,52 +2357,24 @@
           <w:highlight w:val="yellow"/>
           <w:lang w:val="es-DO"/>
         </w:rPr>
-        <w:t>PUT    /api/v1/</w:t>
-      </w:r>
-      <w:proofErr w:type="spellStart"/>
+        <w:t>PUT    /api/v1/students/</w:t>
+      </w:r>
       <w:r>
         <w:rPr>
           <w:rFonts w:ascii="Times New Roman" w:hAnsi="Times New Roman" w:cs="Times New Roman"/>
           <w:highlight w:val="yellow"/>
           <w:lang w:val="es-DO"/>
         </w:rPr>
-        <w:t>students</w:t>
-      </w:r>
-      <w:proofErr w:type="spellEnd"/>
+        <w:t xml:space="preserve"> Especificar la id en e</w:t>
+      </w:r>
       <w:r>
         <w:rPr>
           <w:rFonts w:ascii="Times New Roman" w:hAnsi="Times New Roman" w:cs="Times New Roman"/>
           <w:highlight w:val="yellow"/>
           <w:lang w:val="es-DO"/>
         </w:rPr>
-        <w:t>/</w:t>
-      </w:r>
-      <w:r>
-        <w:rPr>
-          <w:rFonts w:ascii="Times New Roman" w:hAnsi="Times New Roman" w:cs="Times New Roman"/>
-          <w:highlight w:val="yellow"/>
-          <w:lang w:val="es-DO"/>
-        </w:rPr>
-        <w:t xml:space="preserve"> Especificar la id en e</w:t>
-      </w:r>
-      <w:r>
-        <w:rPr>
-          <w:rFonts w:ascii="Times New Roman" w:hAnsi="Times New Roman" w:cs="Times New Roman"/>
-          <w:highlight w:val="yellow"/>
-          <w:lang w:val="es-DO"/>
-        </w:rPr>
-        <w:t xml:space="preserve">l </w:t>
-      </w:r>
-      <w:proofErr w:type="spellStart"/>
-      <w:r>
-        <w:rPr>
-          <w:rFonts w:ascii="Times New Roman" w:hAnsi="Times New Roman" w:cs="Times New Roman"/>
-          <w:highlight w:val="yellow"/>
-          <w:lang w:val="es-DO"/>
-        </w:rPr>
-        <w:t>body</w:t>
-      </w:r>
-      <w:proofErr w:type="spellEnd"/>
+        <w:t>l body</w:t>
+      </w:r>
     </w:p>
     <w:p>
       <w:pPr>
@@ -3019,46 +2393,14 @@
           <w:rFonts w:ascii="Times New Roman" w:hAnsi="Times New Roman" w:cs="Times New Roman"/>
           <w:highlight w:val="yellow"/>
         </w:rPr>
-        <w:t>DELETE /</w:t>
-      </w:r>
-      <w:proofErr w:type="spellStart"/>
+        <w:t>DELETE /api/v1/students/</w:t>
+      </w:r>
       <w:r>
         <w:rPr>
           <w:rFonts w:ascii="Times New Roman" w:hAnsi="Times New Roman" w:cs="Times New Roman"/>
           <w:highlight w:val="yellow"/>
         </w:rPr>
-        <w:t>api</w:t>
-      </w:r>
-      <w:proofErr w:type="spellEnd"/>
-      <w:r>
-        <w:rPr>
-          <w:rFonts w:ascii="Times New Roman" w:hAnsi="Times New Roman" w:cs="Times New Roman"/>
-          <w:highlight w:val="yellow"/>
-        </w:rPr>
-        <w:t>/v1/</w:t>
-      </w:r>
-      <w:proofErr w:type="gramStart"/>
-      <w:r>
-        <w:rPr>
-          <w:rFonts w:ascii="Times New Roman" w:hAnsi="Times New Roman" w:cs="Times New Roman"/>
-          <w:highlight w:val="yellow"/>
-        </w:rPr>
-        <w:t>students/</w:t>
-      </w:r>
-      <w:r>
-        <w:rPr>
-          <w:rFonts w:ascii="Times New Roman" w:hAnsi="Times New Roman" w:cs="Times New Roman"/>
-          <w:highlight w:val="yellow"/>
-        </w:rPr>
-        <w:t>{{</w:t>
-      </w:r>
-      <w:proofErr w:type="gramEnd"/>
-      <w:r>
-        <w:rPr>
-          <w:rFonts w:ascii="Times New Roman" w:hAnsi="Times New Roman" w:cs="Times New Roman"/>
-          <w:highlight w:val="yellow"/>
-        </w:rPr>
-        <w:t>matricula}}</w:t>
+        <w:t>{{matricula}}</w:t>
       </w:r>
     </w:p>
     <w:p>
@@ -3073,60 +2415,12 @@
           <w:highlight w:val="yellow"/>
         </w:rPr>
       </w:pPr>
-      <w:proofErr w:type="gramStart"/>
       <w:r>
         <w:rPr>
           <w:rFonts w:ascii="Times New Roman" w:hAnsi="Times New Roman" w:cs="Times New Roman"/>
           <w:highlight w:val="yellow"/>
         </w:rPr>
-        <w:t>GET  /</w:t>
-      </w:r>
-      <w:proofErr w:type="spellStart"/>
-      <w:proofErr w:type="gramEnd"/>
-      <w:r>
-        <w:rPr>
-          <w:rFonts w:ascii="Times New Roman" w:hAnsi="Times New Roman" w:cs="Times New Roman"/>
-          <w:highlight w:val="yellow"/>
-        </w:rPr>
-        <w:t>api</w:t>
-      </w:r>
-      <w:proofErr w:type="spellEnd"/>
-      <w:r>
-        <w:rPr>
-          <w:rFonts w:ascii="Times New Roman" w:hAnsi="Times New Roman" w:cs="Times New Roman"/>
-          <w:highlight w:val="yellow"/>
-        </w:rPr>
-        <w:t>/v1/</w:t>
-      </w:r>
-      <w:r>
-        <w:rPr>
-          <w:rFonts w:ascii="Times New Roman" w:hAnsi="Times New Roman" w:cs="Times New Roman"/>
-          <w:highlight w:val="yellow"/>
-        </w:rPr>
-        <w:t>students/</w:t>
-      </w:r>
-      <w:proofErr w:type="gramStart"/>
-      <w:r>
-        <w:rPr>
-          <w:rFonts w:ascii="Times New Roman" w:hAnsi="Times New Roman" w:cs="Times New Roman"/>
-          <w:highlight w:val="yellow"/>
-        </w:rPr>
-        <w:t>records/{</w:t>
-      </w:r>
-      <w:proofErr w:type="gramEnd"/>
-      <w:r>
-        <w:rPr>
-          <w:rFonts w:ascii="Times New Roman" w:hAnsi="Times New Roman" w:cs="Times New Roman"/>
-          <w:highlight w:val="yellow"/>
-        </w:rPr>
-        <w:t>matricula</w:t>
-      </w:r>
-      <w:r>
-        <w:rPr>
-          <w:rFonts w:ascii="Times New Roman" w:hAnsi="Times New Roman" w:cs="Times New Roman"/>
-          <w:highlight w:val="yellow"/>
-        </w:rPr>
-        <w:t>}</w:t>
+        <w:t>GET  /api/v1/students/records/{matricula}</w:t>
       </w:r>
     </w:p>
     <w:p>
@@ -3169,27 +2463,11 @@
           <w:rFonts w:ascii="Times New Roman" w:hAnsi="Times New Roman" w:cs="Times New Roman"/>
         </w:rPr>
       </w:pPr>
-      <w:proofErr w:type="gramStart"/>
-      <w:r>
-        <w:rPr>
-          <w:rFonts w:ascii="Times New Roman" w:hAnsi="Times New Roman" w:cs="Times New Roman"/>
-        </w:rPr>
-        <w:t>GET  /</w:t>
-      </w:r>
-      <w:proofErr w:type="spellStart"/>
-      <w:proofErr w:type="gramEnd"/>
-      <w:r>
-        <w:rPr>
-          <w:rFonts w:ascii="Times New Roman" w:hAnsi="Times New Roman" w:cs="Times New Roman"/>
-        </w:rPr>
-        <w:t>api</w:t>
-      </w:r>
-      <w:proofErr w:type="spellEnd"/>
-      <w:r>
-        <w:rPr>
-          <w:rFonts w:ascii="Times New Roman" w:hAnsi="Times New Roman" w:cs="Times New Roman"/>
-        </w:rPr>
-        <w:t>/v1/records</w:t>
+      <w:r>
+        <w:rPr>
+          <w:rFonts w:ascii="Times New Roman" w:hAnsi="Times New Roman" w:cs="Times New Roman"/>
+        </w:rPr>
+        <w:t>GET  /api/v1/records</w:t>
       </w:r>
     </w:p>
     <w:p>
@@ -3207,21 +2485,7 @@
         <w:rPr>
           <w:rFonts w:ascii="Times New Roman" w:hAnsi="Times New Roman" w:cs="Times New Roman"/>
         </w:rPr>
-        <w:t>POST /</w:t>
-      </w:r>
-      <w:proofErr w:type="spellStart"/>
-      <w:r>
-        <w:rPr>
-          <w:rFonts w:ascii="Times New Roman" w:hAnsi="Times New Roman" w:cs="Times New Roman"/>
-        </w:rPr>
-        <w:t>api</w:t>
-      </w:r>
-      <w:proofErr w:type="spellEnd"/>
-      <w:r>
-        <w:rPr>
-          <w:rFonts w:ascii="Times New Roman" w:hAnsi="Times New Roman" w:cs="Times New Roman"/>
-        </w:rPr>
-        <w:t>/v1/records</w:t>
+        <w:t>POST /api/v1/records</w:t>
       </w:r>
     </w:p>
     <w:p>
@@ -3235,41 +2499,11 @@
           <w:rFonts w:ascii="Times New Roman" w:hAnsi="Times New Roman" w:cs="Times New Roman"/>
         </w:rPr>
       </w:pPr>
-      <w:proofErr w:type="gramStart"/>
-      <w:r>
-        <w:rPr>
-          <w:rFonts w:ascii="Times New Roman" w:hAnsi="Times New Roman" w:cs="Times New Roman"/>
-        </w:rPr>
-        <w:t>PUT  /</w:t>
-      </w:r>
-      <w:proofErr w:type="spellStart"/>
-      <w:proofErr w:type="gramEnd"/>
-      <w:r>
-        <w:rPr>
-          <w:rFonts w:ascii="Times New Roman" w:hAnsi="Times New Roman" w:cs="Times New Roman"/>
-        </w:rPr>
-        <w:t>api</w:t>
-      </w:r>
-      <w:proofErr w:type="spellEnd"/>
-      <w:r>
-        <w:rPr>
-          <w:rFonts w:ascii="Times New Roman" w:hAnsi="Times New Roman" w:cs="Times New Roman"/>
-        </w:rPr>
-        <w:t>/v1/</w:t>
-      </w:r>
-      <w:proofErr w:type="gramStart"/>
-      <w:r>
-        <w:rPr>
-          <w:rFonts w:ascii="Times New Roman" w:hAnsi="Times New Roman" w:cs="Times New Roman"/>
-        </w:rPr>
-        <w:t>records/{</w:t>
-      </w:r>
-      <w:proofErr w:type="gramEnd"/>
-      <w:r>
-        <w:rPr>
-          <w:rFonts w:ascii="Times New Roman" w:hAnsi="Times New Roman" w:cs="Times New Roman"/>
-        </w:rPr>
-        <w:t>id}</w:t>
+      <w:r>
+        <w:rPr>
+          <w:rFonts w:ascii="Times New Roman" w:hAnsi="Times New Roman" w:cs="Times New Roman"/>
+        </w:rPr>
+        <w:t>PUT  /api/v1/records/{id}</w:t>
       </w:r>
     </w:p>
     <w:p>
@@ -3300,21 +2534,7 @@
         <w:rPr>
           <w:rFonts w:ascii="Times New Roman" w:hAnsi="Times New Roman" w:cs="Times New Roman"/>
         </w:rPr>
-        <w:t>GET    /</w:t>
-      </w:r>
-      <w:proofErr w:type="spellStart"/>
-      <w:r>
-        <w:rPr>
-          <w:rFonts w:ascii="Times New Roman" w:hAnsi="Times New Roman" w:cs="Times New Roman"/>
-        </w:rPr>
-        <w:t>api</w:t>
-      </w:r>
-      <w:proofErr w:type="spellEnd"/>
-      <w:r>
-        <w:rPr>
-          <w:rFonts w:ascii="Times New Roman" w:hAnsi="Times New Roman" w:cs="Times New Roman"/>
-        </w:rPr>
-        <w:t>/v1/professors</w:t>
+        <w:t>GET    /api/v1/professors</w:t>
       </w:r>
     </w:p>
     <w:p>
@@ -3332,21 +2552,7 @@
         <w:rPr>
           <w:rFonts w:ascii="Times New Roman" w:hAnsi="Times New Roman" w:cs="Times New Roman"/>
         </w:rPr>
-        <w:t>POST   /</w:t>
-      </w:r>
-      <w:proofErr w:type="spellStart"/>
-      <w:r>
-        <w:rPr>
-          <w:rFonts w:ascii="Times New Roman" w:hAnsi="Times New Roman" w:cs="Times New Roman"/>
-        </w:rPr>
-        <w:t>api</w:t>
-      </w:r>
-      <w:proofErr w:type="spellEnd"/>
-      <w:r>
-        <w:rPr>
-          <w:rFonts w:ascii="Times New Roman" w:hAnsi="Times New Roman" w:cs="Times New Roman"/>
-        </w:rPr>
-        <w:t>/v1/professors</w:t>
+        <w:t>POST   /api/v1/professors</w:t>
       </w:r>
     </w:p>
     <w:p>
@@ -3364,35 +2570,7 @@
         <w:rPr>
           <w:rFonts w:ascii="Times New Roman" w:hAnsi="Times New Roman" w:cs="Times New Roman"/>
         </w:rPr>
-        <w:t>PUT    /</w:t>
-      </w:r>
-      <w:proofErr w:type="spellStart"/>
-      <w:r>
-        <w:rPr>
-          <w:rFonts w:ascii="Times New Roman" w:hAnsi="Times New Roman" w:cs="Times New Roman"/>
-        </w:rPr>
-        <w:t>api</w:t>
-      </w:r>
-      <w:proofErr w:type="spellEnd"/>
-      <w:r>
-        <w:rPr>
-          <w:rFonts w:ascii="Times New Roman" w:hAnsi="Times New Roman" w:cs="Times New Roman"/>
-        </w:rPr>
-        <w:t>/v1/</w:t>
-      </w:r>
-      <w:proofErr w:type="gramStart"/>
-      <w:r>
-        <w:rPr>
-          <w:rFonts w:ascii="Times New Roman" w:hAnsi="Times New Roman" w:cs="Times New Roman"/>
-        </w:rPr>
-        <w:t>professors/{</w:t>
-      </w:r>
-      <w:proofErr w:type="gramEnd"/>
-      <w:r>
-        <w:rPr>
-          <w:rFonts w:ascii="Times New Roman" w:hAnsi="Times New Roman" w:cs="Times New Roman"/>
-        </w:rPr>
-        <w:t>id}</w:t>
+        <w:t>PUT    /api/v1/professors/{id}</w:t>
       </w:r>
     </w:p>
     <w:p>
@@ -3410,35 +2588,7 @@
         <w:rPr>
           <w:rFonts w:ascii="Times New Roman" w:hAnsi="Times New Roman" w:cs="Times New Roman"/>
         </w:rPr>
-        <w:t>DELETE /</w:t>
-      </w:r>
-      <w:proofErr w:type="spellStart"/>
-      <w:r>
-        <w:rPr>
-          <w:rFonts w:ascii="Times New Roman" w:hAnsi="Times New Roman" w:cs="Times New Roman"/>
-        </w:rPr>
-        <w:t>api</w:t>
-      </w:r>
-      <w:proofErr w:type="spellEnd"/>
-      <w:r>
-        <w:rPr>
-          <w:rFonts w:ascii="Times New Roman" w:hAnsi="Times New Roman" w:cs="Times New Roman"/>
-        </w:rPr>
-        <w:t>/v1/</w:t>
-      </w:r>
-      <w:proofErr w:type="gramStart"/>
-      <w:r>
-        <w:rPr>
-          <w:rFonts w:ascii="Times New Roman" w:hAnsi="Times New Roman" w:cs="Times New Roman"/>
-        </w:rPr>
-        <w:t>professors/{</w:t>
-      </w:r>
-      <w:proofErr w:type="gramEnd"/>
-      <w:r>
-        <w:rPr>
-          <w:rFonts w:ascii="Times New Roman" w:hAnsi="Times New Roman" w:cs="Times New Roman"/>
-        </w:rPr>
-        <w:t>id}</w:t>
+        <w:t>DELETE /api/v1/professors/{id}</w:t>
       </w:r>
     </w:p>
     <w:p>
@@ -3483,21 +2633,7 @@
         <w:rPr>
           <w:rFonts w:ascii="Times New Roman" w:hAnsi="Times New Roman" w:cs="Times New Roman"/>
         </w:rPr>
-        <w:t>GET    /</w:t>
-      </w:r>
-      <w:proofErr w:type="spellStart"/>
-      <w:r>
-        <w:rPr>
-          <w:rFonts w:ascii="Times New Roman" w:hAnsi="Times New Roman" w:cs="Times New Roman"/>
-        </w:rPr>
-        <w:t>api</w:t>
-      </w:r>
-      <w:proofErr w:type="spellEnd"/>
-      <w:r>
-        <w:rPr>
-          <w:rFonts w:ascii="Times New Roman" w:hAnsi="Times New Roman" w:cs="Times New Roman"/>
-        </w:rPr>
-        <w:t>/v1/departments</w:t>
+        <w:t>GET    /api/v1/departments</w:t>
       </w:r>
     </w:p>
     <w:p>
@@ -3515,21 +2651,7 @@
         <w:rPr>
           <w:rFonts w:ascii="Times New Roman" w:hAnsi="Times New Roman" w:cs="Times New Roman"/>
         </w:rPr>
-        <w:t>POST   /</w:t>
-      </w:r>
-      <w:proofErr w:type="spellStart"/>
-      <w:r>
-        <w:rPr>
-          <w:rFonts w:ascii="Times New Roman" w:hAnsi="Times New Roman" w:cs="Times New Roman"/>
-        </w:rPr>
-        <w:t>api</w:t>
-      </w:r>
-      <w:proofErr w:type="spellEnd"/>
-      <w:r>
-        <w:rPr>
-          <w:rFonts w:ascii="Times New Roman" w:hAnsi="Times New Roman" w:cs="Times New Roman"/>
-        </w:rPr>
-        <w:t>/v1/departments</w:t>
+        <w:t>POST   /api/v1/departments</w:t>
       </w:r>
     </w:p>
     <w:p>
@@ -3547,35 +2669,7 @@
         <w:rPr>
           <w:rFonts w:ascii="Times New Roman" w:hAnsi="Times New Roman" w:cs="Times New Roman"/>
         </w:rPr>
-        <w:t>PUT    /</w:t>
-      </w:r>
-      <w:proofErr w:type="spellStart"/>
-      <w:r>
-        <w:rPr>
-          <w:rFonts w:ascii="Times New Roman" w:hAnsi="Times New Roman" w:cs="Times New Roman"/>
-        </w:rPr>
-        <w:t>api</w:t>
-      </w:r>
-      <w:proofErr w:type="spellEnd"/>
-      <w:r>
-        <w:rPr>
-          <w:rFonts w:ascii="Times New Roman" w:hAnsi="Times New Roman" w:cs="Times New Roman"/>
-        </w:rPr>
-        <w:t>/v1/</w:t>
-      </w:r>
-      <w:proofErr w:type="gramStart"/>
-      <w:r>
-        <w:rPr>
-          <w:rFonts w:ascii="Times New Roman" w:hAnsi="Times New Roman" w:cs="Times New Roman"/>
-        </w:rPr>
-        <w:t>departments/{</w:t>
-      </w:r>
-      <w:proofErr w:type="gramEnd"/>
-      <w:r>
-        <w:rPr>
-          <w:rFonts w:ascii="Times New Roman" w:hAnsi="Times New Roman" w:cs="Times New Roman"/>
-        </w:rPr>
-        <w:t>id}</w:t>
+        <w:t>PUT    /api/v1/departments/{id}</w:t>
       </w:r>
     </w:p>
     <w:p>
@@ -3593,35 +2687,7 @@
         <w:rPr>
           <w:rFonts w:ascii="Times New Roman" w:hAnsi="Times New Roman" w:cs="Times New Roman"/>
         </w:rPr>
-        <w:t>DELETE /</w:t>
-      </w:r>
-      <w:proofErr w:type="spellStart"/>
-      <w:r>
-        <w:rPr>
-          <w:rFonts w:ascii="Times New Roman" w:hAnsi="Times New Roman" w:cs="Times New Roman"/>
-        </w:rPr>
-        <w:t>api</w:t>
-      </w:r>
-      <w:proofErr w:type="spellEnd"/>
-      <w:r>
-        <w:rPr>
-          <w:rFonts w:ascii="Times New Roman" w:hAnsi="Times New Roman" w:cs="Times New Roman"/>
-        </w:rPr>
-        <w:t>/v1/</w:t>
-      </w:r>
-      <w:proofErr w:type="gramStart"/>
-      <w:r>
-        <w:rPr>
-          <w:rFonts w:ascii="Times New Roman" w:hAnsi="Times New Roman" w:cs="Times New Roman"/>
-        </w:rPr>
-        <w:t>departments/{</w:t>
-      </w:r>
-      <w:proofErr w:type="gramEnd"/>
-      <w:r>
-        <w:rPr>
-          <w:rFonts w:ascii="Times New Roman" w:hAnsi="Times New Roman" w:cs="Times New Roman"/>
-        </w:rPr>
-        <w:t>id}</w:t>
+        <w:t>DELETE /api/v1/departments/{id}</w:t>
       </w:r>
     </w:p>
     <w:p>
@@ -3665,21 +2731,7 @@
         <w:rPr>
           <w:rFonts w:ascii="Times New Roman" w:hAnsi="Times New Roman" w:cs="Times New Roman"/>
         </w:rPr>
-        <w:t>GET    /</w:t>
-      </w:r>
-      <w:proofErr w:type="spellStart"/>
-      <w:r>
-        <w:rPr>
-          <w:rFonts w:ascii="Times New Roman" w:hAnsi="Times New Roman" w:cs="Times New Roman"/>
-        </w:rPr>
-        <w:t>api</w:t>
-      </w:r>
-      <w:proofErr w:type="spellEnd"/>
-      <w:r>
-        <w:rPr>
-          <w:rFonts w:ascii="Times New Roman" w:hAnsi="Times New Roman" w:cs="Times New Roman"/>
-        </w:rPr>
-        <w:t>/v1/subjects</w:t>
+        <w:t>GET    /api/v1/subjects</w:t>
       </w:r>
     </w:p>
     <w:p>
@@ -3697,21 +2749,7 @@
         <w:rPr>
           <w:rFonts w:ascii="Times New Roman" w:hAnsi="Times New Roman" w:cs="Times New Roman"/>
         </w:rPr>
-        <w:t>POST   /</w:t>
-      </w:r>
-      <w:proofErr w:type="spellStart"/>
-      <w:r>
-        <w:rPr>
-          <w:rFonts w:ascii="Times New Roman" w:hAnsi="Times New Roman" w:cs="Times New Roman"/>
-        </w:rPr>
-        <w:t>api</w:t>
-      </w:r>
-      <w:proofErr w:type="spellEnd"/>
-      <w:r>
-        <w:rPr>
-          <w:rFonts w:ascii="Times New Roman" w:hAnsi="Times New Roman" w:cs="Times New Roman"/>
-        </w:rPr>
-        <w:t>/v1/subjects</w:t>
+        <w:t>POST   /api/v1/subjects</w:t>
       </w:r>
     </w:p>
     <w:p>
@@ -3729,35 +2767,7 @@
         <w:rPr>
           <w:rFonts w:ascii="Times New Roman" w:hAnsi="Times New Roman" w:cs="Times New Roman"/>
         </w:rPr>
-        <w:t>GET    /</w:t>
-      </w:r>
-      <w:proofErr w:type="spellStart"/>
-      <w:r>
-        <w:rPr>
-          <w:rFonts w:ascii="Times New Roman" w:hAnsi="Times New Roman" w:cs="Times New Roman"/>
-        </w:rPr>
-        <w:t>api</w:t>
-      </w:r>
-      <w:proofErr w:type="spellEnd"/>
-      <w:r>
-        <w:rPr>
-          <w:rFonts w:ascii="Times New Roman" w:hAnsi="Times New Roman" w:cs="Times New Roman"/>
-        </w:rPr>
-        <w:t>/v1/</w:t>
-      </w:r>
-      <w:proofErr w:type="gramStart"/>
-      <w:r>
-        <w:rPr>
-          <w:rFonts w:ascii="Times New Roman" w:hAnsi="Times New Roman" w:cs="Times New Roman"/>
-        </w:rPr>
-        <w:t>subjects/{</w:t>
-      </w:r>
-      <w:proofErr w:type="gramEnd"/>
-      <w:r>
-        <w:rPr>
-          <w:rFonts w:ascii="Times New Roman" w:hAnsi="Times New Roman" w:cs="Times New Roman"/>
-        </w:rPr>
-        <w:t>id}</w:t>
+        <w:t>GET    /api/v1/subjects/{id}</w:t>
       </w:r>
     </w:p>
     <w:p>
@@ -3775,35 +2785,7 @@
         <w:rPr>
           <w:rFonts w:ascii="Times New Roman" w:hAnsi="Times New Roman" w:cs="Times New Roman"/>
         </w:rPr>
-        <w:t>PUT    /</w:t>
-      </w:r>
-      <w:proofErr w:type="spellStart"/>
-      <w:r>
-        <w:rPr>
-          <w:rFonts w:ascii="Times New Roman" w:hAnsi="Times New Roman" w:cs="Times New Roman"/>
-        </w:rPr>
-        <w:t>api</w:t>
-      </w:r>
-      <w:proofErr w:type="spellEnd"/>
-      <w:r>
-        <w:rPr>
-          <w:rFonts w:ascii="Times New Roman" w:hAnsi="Times New Roman" w:cs="Times New Roman"/>
-        </w:rPr>
-        <w:t>/v1/</w:t>
-      </w:r>
-      <w:proofErr w:type="gramStart"/>
-      <w:r>
-        <w:rPr>
-          <w:rFonts w:ascii="Times New Roman" w:hAnsi="Times New Roman" w:cs="Times New Roman"/>
-        </w:rPr>
-        <w:t>subjects/{</w:t>
-      </w:r>
-      <w:proofErr w:type="gramEnd"/>
-      <w:r>
-        <w:rPr>
-          <w:rFonts w:ascii="Times New Roman" w:hAnsi="Times New Roman" w:cs="Times New Roman"/>
-        </w:rPr>
-        <w:t>id}</w:t>
+        <w:t>PUT    /api/v1/subjects/{id}</w:t>
       </w:r>
     </w:p>
     <w:p>
@@ -3834,21 +2816,7 @@
         <w:rPr>
           <w:rFonts w:ascii="Times New Roman" w:hAnsi="Times New Roman" w:cs="Times New Roman"/>
         </w:rPr>
-        <w:t>POST   /</w:t>
-      </w:r>
-      <w:proofErr w:type="spellStart"/>
-      <w:r>
-        <w:rPr>
-          <w:rFonts w:ascii="Times New Roman" w:hAnsi="Times New Roman" w:cs="Times New Roman"/>
-        </w:rPr>
-        <w:t>api</w:t>
-      </w:r>
-      <w:proofErr w:type="spellEnd"/>
-      <w:r>
-        <w:rPr>
-          <w:rFonts w:ascii="Times New Roman" w:hAnsi="Times New Roman" w:cs="Times New Roman"/>
-        </w:rPr>
-        <w:t>/v1/enrollments</w:t>
+        <w:t>POST   /api/v1/enrollments</w:t>
       </w:r>
     </w:p>
     <w:p>
@@ -3866,43 +2834,7 @@
         <w:rPr>
           <w:rFonts w:ascii="Times New Roman" w:hAnsi="Times New Roman" w:cs="Times New Roman"/>
         </w:rPr>
-        <w:t>GET    /</w:t>
-      </w:r>
-      <w:proofErr w:type="spellStart"/>
-      <w:r>
-        <w:rPr>
-          <w:rFonts w:ascii="Times New Roman" w:hAnsi="Times New Roman" w:cs="Times New Roman"/>
-        </w:rPr>
-        <w:t>api</w:t>
-      </w:r>
-      <w:proofErr w:type="spellEnd"/>
-      <w:r>
-        <w:rPr>
-          <w:rFonts w:ascii="Times New Roman" w:hAnsi="Times New Roman" w:cs="Times New Roman"/>
-        </w:rPr>
-        <w:t>/v1/enrollments/</w:t>
-      </w:r>
-      <w:proofErr w:type="gramStart"/>
-      <w:r>
-        <w:rPr>
-          <w:rFonts w:ascii="Times New Roman" w:hAnsi="Times New Roman" w:cs="Times New Roman"/>
-        </w:rPr>
-        <w:t>record/{</w:t>
-      </w:r>
-      <w:proofErr w:type="spellStart"/>
-      <w:proofErr w:type="gramEnd"/>
-      <w:r>
-        <w:rPr>
-          <w:rFonts w:ascii="Times New Roman" w:hAnsi="Times New Roman" w:cs="Times New Roman"/>
-        </w:rPr>
-        <w:t>recordId</w:t>
-      </w:r>
-      <w:proofErr w:type="spellEnd"/>
-      <w:r>
-        <w:rPr>
-          <w:rFonts w:ascii="Times New Roman" w:hAnsi="Times New Roman" w:cs="Times New Roman"/>
-        </w:rPr>
-        <w:t>}</w:t>
+        <w:t>GET    /api/v1/enrollments/record/{recordId}</w:t>
       </w:r>
     </w:p>
     <w:p>
@@ -3922,23 +2854,7 @@
           <w:rFonts w:ascii="Times New Roman" w:hAnsi="Times New Roman" w:cs="Times New Roman"/>
           <w:lang w:val="es-DO"/>
         </w:rPr>
-        <w:t>DELETE /api/v1/</w:t>
-      </w:r>
-      <w:proofErr w:type="spellStart"/>
-      <w:r>
-        <w:rPr>
-          <w:rFonts w:ascii="Times New Roman" w:hAnsi="Times New Roman" w:cs="Times New Roman"/>
-          <w:lang w:val="es-DO"/>
-        </w:rPr>
-        <w:t>enrollments</w:t>
-      </w:r>
-      <w:proofErr w:type="spellEnd"/>
-      <w:r>
-        <w:rPr>
-          <w:rFonts w:ascii="Times New Roman" w:hAnsi="Times New Roman" w:cs="Times New Roman"/>
-          <w:lang w:val="es-DO"/>
-        </w:rPr>
-        <w:t>/{id}</w:t>
+        <w:t>DELETE /api/v1/enrollments/{id}</w:t>
       </w:r>
     </w:p>
     <w:p>

</xml_diff>